<commit_message>
Rebuild the BRD-13 migration pack without migration wave codes and internal source names
</commit_message>
<xml_diff>
--- a/docs/deliverables/out/Drop-0_Setup_and_Data_Migration/BRD-13_Data_Migration/BIBS_Migration_BRD-13_Cutover_Runbook_v1.2.docx
+++ b/docs/deliverables/out/Drop-0_Setup_and_Data_Migration/BRD-13_Data_Migration/BIBS_Migration_BRD-13_Cutover_Runbook_v1.2.docx
@@ -3753,7 +3753,7 @@
               <w:rPr>
                 <w:sz w:val="17"/>
               </w:rPr>
-              <w:t>iorta TechNXT QA (smoke tests, defect triage)</w:t>
+              <w:t>iorta TechNXT QA (smoke tests, issue triage)</w:t>
             </w:r>
           </w:p>
         </w:tc>
@@ -6990,7 +6990,7 @@
       <w:r>
         <w:drawing>
           <wp:inline xmlns:a="http://schemas.openxmlformats.org/drawingml/2006/main" xmlns:pic="http://schemas.openxmlformats.org/drawingml/2006/picture">
-            <wp:extent cx="5760000" cy="4044909"/>
+            <wp:extent cx="5760000" cy="4042766"/>
             <wp:docPr id="3" name="Picture 3"/>
             <wp:cNvGraphicFramePr>
               <a:graphicFrameLocks noChangeAspect="1"/>
@@ -6999,7 +6999,7 @@
               <a:graphicData uri="http://schemas.openxmlformats.org/drawingml/2006/picture">
                 <pic:pic>
                   <pic:nvPicPr>
-                    <pic:cNvPr id="0" name="dm_cutover_weekend.png"/>
+                    <pic:cNvPr id="0" name="dm_cutover_weekend_1070.jpg"/>
                     <pic:cNvPicPr/>
                   </pic:nvPicPr>
                   <pic:blipFill>
@@ -7011,7 +7011,7 @@
                   <pic:spPr>
                     <a:xfrm>
                       <a:off x="0" y="0"/>
-                      <a:ext cx="5760000" cy="4044909"/>
+                      <a:ext cx="5760000" cy="4042766"/>
                     </a:xfrm>
                     <a:prstGeom prst="rect"/>
                   </pic:spPr>
@@ -7932,7 +7932,7 @@
               <w:rPr>
                 <w:sz w:val="17"/>
               </w:rPr>
-              <w:t>Hotfix of a Critical defect approved by the go / no-go board</w:t>
+              <w:t>Hotfix of a Critical issue approved by the go / no-go board</w:t>
             </w:r>
           </w:p>
         </w:tc>
@@ -8453,7 +8453,7 @@
               <w:rPr>
                 <w:sz w:val="17"/>
               </w:rPr>
-              <w:t>No open Critical defect of the migration or of a Day-1 module</w:t>
+              <w:t>No open Critical issue of the migration or of a Day-1 module</w:t>
             </w:r>
           </w:p>
         </w:tc>
@@ -9805,7 +9805,7 @@
               <w:rPr>
                 <w:sz w:val="17"/>
               </w:rPr>
-              <w:t>No Critical defect that stops receipts, payment application, remittance or booking</w:t>
+              <w:t>No Critical issue that stops receipts, payment application, remittance or booking</w:t>
             </w:r>
           </w:p>
         </w:tc>
@@ -11264,7 +11264,7 @@
               <w:rPr>
                 <w:sz w:val="16"/>
               </w:rPr>
-              <w:t>Production environment ready - BIBS release of the go-live build deployed, MIG_ENVIRONMENT_CLASS = PRODUCTION, MIG_CUTOVER_DATE = T, MIG_OPENING_VALUE_DATE = 1-Jan-2028, MIG_GOLIVE_RENEWAL_TO = 31-May-2028, MIG_RENEWAL_URGENT_TO = 31-Jan-2028, jobs scheduled</w:t>
+              <w:t>Production environment ready - BIBS release of the go-live release deployed, MIG_ENVIRONMENT_CLASS = PRODUCTION, MIG_CUTOVER_DATE = T, MIG_OPENING_VALUE_DATE = 1-Jan-2028, MIG_GOLIVE_RENEWAL_TO = 31-May-2028, MIG_RENEWAL_URGENT_TO = 31-Jan-2028, jobs scheduled</w:t>
             </w:r>
           </w:p>
         </w:tc>
@@ -20903,7 +20903,7 @@
               <w:rPr>
                 <w:sz w:val="16"/>
               </w:rPr>
-              <w:t>Prepare the go / no-go pack - MIG-GONOGO with measured criteria, open defects, sign-off status</w:t>
+              <w:t>Prepare the go / no-go pack - MIG-GONOGO with measured criteria, open issues, sign-off status</w:t>
             </w:r>
           </w:p>
         </w:tc>
@@ -22782,7 +22782,7 @@
               <w:rPr>
                 <w:sz w:val="16"/>
               </w:rPr>
-              <w:t>Midday check - defects, queues, Migration Clearing still 0.00, no legacy business posting</w:t>
+              <w:t>Midday check - issues, queues, Migration Clearing still 0.00, no legacy business posting</w:t>
             </w:r>
           </w:p>
         </w:tc>
@@ -23679,7 +23679,7 @@
               <w:rPr>
                 <w:sz w:val="16"/>
               </w:rPr>
-              <w:t>Defect triage twice a day (10:00 and 16:00) with Operations, Comptrollership, Renewal and iorta QA</w:t>
+              <w:t>Issue triage twice a day (10:00 and 16:00) with Operations, Comptrollership, Renewal and iorta QA</w:t>
             </w:r>
           </w:p>
         </w:tc>
@@ -23771,7 +23771,7 @@
               <w:rPr>
                 <w:sz w:val="16"/>
               </w:rPr>
-              <w:t>Defect log updated; severity agreed</w:t>
+              <w:t>Issue log updated; severity agreed</w:t>
             </w:r>
           </w:p>
         </w:tc>
@@ -24333,7 +24333,7 @@
               <w:rPr>
                 <w:sz w:val="16"/>
               </w:rPr>
-              <w:t>Week-1 review with the board - defects, volumes, performance, renewal queue, user feedback</w:t>
+              <w:t>Week-1 review with the board - issues, volumes, performance, renewal queue, user feedback</w:t>
             </w:r>
           </w:p>
         </w:tc>
@@ -28746,7 +28746,7 @@
     <w:p>
       <w:r>
         <w:rPr/>
-        <w:t>After the point of no return, there is no technical rollback. A defect is fixed forward in BIBS through the normal business functions (correction, reversal, adjustment), with the change visible in the Prod Recon legacy change report where it touches a legacy invoice. The true-ups come after the point of no return; a true-up that is wrong is corrected by the next true-up, never by editing a posted journal.</w:t>
+        <w:t>After the point of no return, there is no technical rollback. An issue is corrected forward in BIBS through the normal business functions (correction, reversal, adjustment), with the change visible in the Prod Recon legacy change report where it touches a legacy invoice. The true-ups come after the point of no return; a true-up that is wrong is corrected by the next true-up, never by editing a posted journal.</w:t>
       </w:r>
     </w:p>
     <w:p>
@@ -30797,7 +30797,7 @@
       </w:r>
       <w:r>
         <w:rPr/>
-        <w:t xml:space="preserve"> (task CT-071): Migration Clearing 0.00 per branch and currency; legacy control accounts against their sub-ledgers (ACSL, context LEGACY); automatch runs and the unapplied items they left; URGENT January renewals without an RA sent or an insurer request; payment file results; exception queues (rejected receipts, remittance exclusions, failed postings); failed jobs and alerts; open defects by severity; user tickets by department.</w:t>
+        <w:t xml:space="preserve"> (task CT-071): Migration Clearing 0.00 per branch and currency; legacy control accounts against their sub-ledgers (ACSL, context LEGACY); automatch runs and the unapplied items they left; URGENT January renewals without an RA sent or an insurer request; payment file results; exception queues (rejected receipts, remittance exclusions, failed postings); failed jobs and alerts; open issues by severity; user tickets by department.</w:t>
       </w:r>
     </w:p>
     <w:p>
@@ -31978,7 +31978,7 @@
               <w:rPr>
                 <w:sz w:val="18"/>
               </w:rPr>
-              <w:t>No open Critical or High defect; Medium defects have an agreed fix date</w:t>
+              <w:t>No open Critical or High issue; Medium issues have an agreed fix date</w:t>
             </w:r>
           </w:p>
         </w:tc>

</xml_diff>